<commit_message>
Entregables al dia, desde el commit e149c9b del repositorio de trabajo
</commit_message>
<xml_diff>
--- a/ENTREGA FINAL/05 - Documentación técnica/3 - Diagramas del sistema.docx
+++ b/ENTREGA FINAL/05 - Documentación técnica/3 - Diagramas del sistema.docx
@@ -1896,7 +1896,7 @@
       <w:r>
         <w:drawing>
           <wp:inline xmlns:a="http://schemas.openxmlformats.org/drawingml/2006/main" xmlns:pic="http://schemas.openxmlformats.org/drawingml/2006/picture">
-            <wp:extent cx="5943600" cy="5036949"/>
+            <wp:extent cx="5943600" cy="5689961"/>
             <wp:docPr id="8" name="Picture 8" descr="Casos de uso, por perfil que los ejecuta" title="Casos de uso, por perfil que los ejecuta"/>
             <wp:cNvGraphicFramePr>
               <a:graphicFrameLocks noChangeAspect="1"/>
@@ -1917,7 +1917,7 @@
                   <pic:spPr>
                     <a:xfrm>
                       <a:off x="0" y="0"/>
-                      <a:ext cx="5943600" cy="5036949"/>
+                      <a:ext cx="5943600" cy="5689961"/>
                     </a:xfrm>
                     <a:prstGeom prst="rect"/>
                     <a:ln w="6350">

</xml_diff>